<commit_message>
Audit fixes: safe image uploads, preview checks without alerts, no post-id reuse, reseed-safe forum crawling, takedown guard, localhost-only command center, SQLite WAL, forum open-redirect fix
Co-Authored-By: Claude Opus 5.5 <noreply@anthropic.com>
Claude-Session: https://claude.ai/code/session_017kSrnrRRwV6yimEEKpq2Uf
</commit_message>
<xml_diff>
--- a/docs/MuleWatch_Demo_Guide.docx
+++ b/docs/MuleWatch_Demo_Guide.docx
@@ -2324,7 +2324,7 @@
                 <w:sz w:val="19"/>
                 <w:szCs w:val="19"/>
               </w:rPr>
-              <w:t xml:space="preserve">Open on the projector laptop</w:t>
+              <w:t xml:space="preserve">Open on the projector laptop. If port 8000 is busy, run.sh prints the port it used (e.g. 8001)</w:t>
             </w:r>
           </w:p>
         </w:tc>
@@ -10904,7 +10904,7 @@
                 <w:sz w:val="19"/>
                 <w:szCs w:val="19"/>
               </w:rPr>
-              <w:t xml:space="preserve">Port 8000 already in use</w:t>
+              <w:t xml:space="preserve">Command center opened on 8001, not 8000</w:t>
             </w:r>
           </w:p>
         </w:tc>
@@ -10934,7 +10934,7 @@
                 <w:sz w:val="19"/>
                 <w:szCs w:val="19"/>
               </w:rPr>
-              <w:t xml:space="preserve">A previous run is still open</w:t>
+              <w:t xml:space="preserve">Another program on the laptop already uses port 8000; run.sh picks the next free port</w:t>
             </w:r>
           </w:p>
         </w:tc>
@@ -10958,6 +10958,14 @@
             <w:pPr>
               <w:spacing w:after="30" w:line="260"/>
             </w:pPr>
+            <w:r>
+              <w:rPr>
+                <w:rFonts w:ascii="Arial" w:cs="Arial" w:eastAsia="Arial" w:hAnsi="Arial"/>
+                <w:sz w:val="19"/>
+                <w:szCs w:val="19"/>
+              </w:rPr>
+              <w:t xml:space="preserve">Use the address run.sh prints, or choose one: </w:t>
+            </w:r>
             <w:r>
               <w:rPr>
                 <w:rFonts w:ascii="Consolas" w:cs="Consolas" w:eastAsia="Consolas" w:hAnsi="Consolas"/>
@@ -10966,15 +10974,209 @@
                 <w:szCs w:val="18"/>
                 <w:shd w:fill="EEF0F7" w:color="auto" w:val="clear"/>
               </w:rPr>
+              <w:t xml:space="preserve">./run.sh --port 8010</w:t>
+            </w:r>
+          </w:p>
+        </w:tc>
+      </w:tr>
+      <w:tr>
+        <w:trPr>
+          <w:cantSplit/>
+          <w:tblHeader w:val="false"/>
+        </w:trPr>
+        <w:tc>
+          <w:tcPr>
+            <w:tcW w:type="dxa" w:w="2700"/>
+            <w:tcBorders>
+              <w:top w:val="single" w:color="D5DBE7" w:sz="4"/>
+              <w:left w:val="single" w:color="D5DBE7" w:sz="4"/>
+              <w:bottom w:val="single" w:color="D5DBE7" w:sz="4"/>
+              <w:right w:val="single" w:color="D5DBE7" w:sz="4"/>
+            </w:tcBorders>
+            <w:tcMar>
+              <w:top w:type="dxa" w:w="70"/>
+              <w:left w:type="dxa" w:w="110"/>
+              <w:bottom w:type="dxa" w:w="70"/>
+              <w:right w:type="dxa" w:w="110"/>
+            </w:tcMar>
+          </w:tcPr>
+          <w:p>
+            <w:pPr>
+              <w:spacing w:after="30" w:line="260"/>
+            </w:pPr>
+            <w:r>
+              <w:rPr>
+                <w:rFonts w:ascii="Arial" w:cs="Arial" w:eastAsia="Arial" w:hAnsi="Arial"/>
+                <w:sz w:val="19"/>
+                <w:szCs w:val="19"/>
+              </w:rPr>
+              <w:t xml:space="preserve">Old MuleWatch still running in another terminal</w:t>
+            </w:r>
+          </w:p>
+        </w:tc>
+        <w:tc>
+          <w:tcPr>
+            <w:tcW w:type="dxa" w:w="2600"/>
+            <w:tcBorders>
+              <w:top w:val="single" w:color="D5DBE7" w:sz="4"/>
+              <w:left w:val="single" w:color="D5DBE7" w:sz="4"/>
+              <w:bottom w:val="single" w:color="D5DBE7" w:sz="4"/>
+              <w:right w:val="single" w:color="D5DBE7" w:sz="4"/>
+            </w:tcBorders>
+            <w:tcMar>
+              <w:top w:type="dxa" w:w="70"/>
+              <w:left w:type="dxa" w:w="110"/>
+              <w:bottom w:type="dxa" w:w="70"/>
+              <w:right w:type="dxa" w:w="110"/>
+            </w:tcMar>
+          </w:tcPr>
+          <w:p>
+            <w:pPr>
+              <w:spacing w:after="30" w:line="260"/>
+            </w:pPr>
+            <w:r>
+              <w:rPr>
+                <w:rFonts w:ascii="Arial" w:cs="Arial" w:eastAsia="Arial" w:hAnsi="Arial"/>
+                <w:sz w:val="19"/>
+                <w:szCs w:val="19"/>
+              </w:rPr>
+              <w:t xml:space="preserve">A previous run.sh was not stopped</w:t>
+            </w:r>
+          </w:p>
+        </w:tc>
+        <w:tc>
+          <w:tcPr>
+            <w:tcW w:type="dxa" w:w="4338"/>
+            <w:tcBorders>
+              <w:top w:val="single" w:color="D5DBE7" w:sz="4"/>
+              <w:left w:val="single" w:color="D5DBE7" w:sz="4"/>
+              <w:bottom w:val="single" w:color="D5DBE7" w:sz="4"/>
+              <w:right w:val="single" w:color="D5DBE7" w:sz="4"/>
+            </w:tcBorders>
+            <w:tcMar>
+              <w:top w:type="dxa" w:w="70"/>
+              <w:left w:type="dxa" w:w="110"/>
+              <w:bottom w:type="dxa" w:w="70"/>
+              <w:right w:type="dxa" w:w="110"/>
+            </w:tcMar>
+          </w:tcPr>
+          <w:p>
+            <w:pPr>
+              <w:spacing w:after="30" w:line="260"/>
+            </w:pPr>
+            <w:r>
+              <w:rPr>
+                <w:rFonts w:ascii="Arial" w:cs="Arial" w:eastAsia="Arial" w:hAnsi="Arial"/>
+                <w:sz w:val="19"/>
+                <w:szCs w:val="19"/>
+              </w:rPr>
+              <w:t xml:space="preserve">Press Ctrl+C in that terminal, or </w:t>
+            </w:r>
+            <w:r>
+              <w:rPr>
+                <w:rFonts w:ascii="Consolas" w:cs="Consolas" w:eastAsia="Consolas" w:hAnsi="Consolas"/>
+                <w:color w:val="1F2A7A"/>
+                <w:sz w:val="18"/>
+                <w:szCs w:val="18"/>
+                <w:shd w:fill="EEF0F7" w:color="auto" w:val="clear"/>
+              </w:rPr>
               <w:t xml:space="preserve">fuser -k 8000/tcp 8100/tcp</w:t>
             </w:r>
-            <w:r>
-              <w:rPr>
-                <w:rFonts w:ascii="Arial" w:cs="Arial" w:eastAsia="Arial" w:hAnsi="Arial"/>
-                <w:sz w:val="19"/>
-                <w:szCs w:val="19"/>
-              </w:rPr>
-              <w:t xml:space="preserve">, then start again</w:t>
+          </w:p>
+        </w:tc>
+      </w:tr>
+      <w:tr>
+        <w:trPr>
+          <w:cantSplit/>
+          <w:tblHeader w:val="false"/>
+        </w:trPr>
+        <w:tc>
+          <w:tcPr>
+            <w:tcW w:type="dxa" w:w="2700"/>
+            <w:tcBorders>
+              <w:top w:val="single" w:color="D5DBE7" w:sz="4"/>
+              <w:left w:val="single" w:color="D5DBE7" w:sz="4"/>
+              <w:bottom w:val="single" w:color="D5DBE7" w:sz="4"/>
+              <w:right w:val="single" w:color="D5DBE7" w:sz="4"/>
+            </w:tcBorders>
+            <w:tcMar>
+              <w:top w:type="dxa" w:w="70"/>
+              <w:left w:type="dxa" w:w="110"/>
+              <w:bottom w:type="dxa" w:w="70"/>
+              <w:right w:type="dxa" w:w="110"/>
+            </w:tcMar>
+          </w:tcPr>
+          <w:p>
+            <w:pPr>
+              <w:spacing w:after="30" w:line="260"/>
+            </w:pPr>
+            <w:r>
+              <w:rPr>
+                <w:rFonts w:ascii="Arial" w:cs="Arial" w:eastAsia="Arial" w:hAnsi="Arial"/>
+                <w:sz w:val="19"/>
+                <w:szCs w:val="19"/>
+              </w:rPr>
+              <w:t xml:space="preserve">Request takedown says the post is no longer on the forum</w:t>
+            </w:r>
+          </w:p>
+        </w:tc>
+        <w:tc>
+          <w:tcPr>
+            <w:tcW w:type="dxa" w:w="2600"/>
+            <w:tcBorders>
+              <w:top w:val="single" w:color="D5DBE7" w:sz="4"/>
+              <w:left w:val="single" w:color="D5DBE7" w:sz="4"/>
+              <w:bottom w:val="single" w:color="D5DBE7" w:sz="4"/>
+              <w:right w:val="single" w:color="D5DBE7" w:sz="4"/>
+            </w:tcBorders>
+            <w:tcMar>
+              <w:top w:type="dxa" w:w="70"/>
+              <w:left w:type="dxa" w:w="110"/>
+              <w:bottom w:type="dxa" w:w="70"/>
+              <w:right w:type="dxa" w:w="110"/>
+            </w:tcMar>
+          </w:tcPr>
+          <w:p>
+            <w:pPr>
+              <w:spacing w:after="30" w:line="260"/>
+            </w:pPr>
+            <w:r>
+              <w:rPr>
+                <w:rFonts w:ascii="Arial" w:cs="Arial" w:eastAsia="Arial" w:hAnsi="Arial"/>
+                <w:sz w:val="19"/>
+                <w:szCs w:val="19"/>
+              </w:rPr>
+              <w:t xml:space="preserve">The forum was reset after this case was captured</w:t>
+            </w:r>
+          </w:p>
+        </w:tc>
+        <w:tc>
+          <w:tcPr>
+            <w:tcW w:type="dxa" w:w="4338"/>
+            <w:tcBorders>
+              <w:top w:val="single" w:color="D5DBE7" w:sz="4"/>
+              <w:left w:val="single" w:color="D5DBE7" w:sz="4"/>
+              <w:bottom w:val="single" w:color="D5DBE7" w:sz="4"/>
+              <w:right w:val="single" w:color="D5DBE7" w:sz="4"/>
+            </w:tcBorders>
+            <w:tcMar>
+              <w:top w:type="dxa" w:w="70"/>
+              <w:left w:type="dxa" w:w="110"/>
+              <w:bottom w:type="dxa" w:w="70"/>
+              <w:right w:type="dxa" w:w="110"/>
+            </w:tcMar>
+          </w:tcPr>
+          <w:p>
+            <w:pPr>
+              <w:spacing w:after="30" w:line="260"/>
+            </w:pPr>
+            <w:r>
+              <w:rPr>
+                <w:rFonts w:ascii="Arial" w:cs="Arial" w:eastAsia="Arial" w:hAnsi="Arial"/>
+                <w:sz w:val="19"/>
+                <w:szCs w:val="19"/>
+              </w:rPr>
+              <w:t xml:space="preserve">Expected; take down a post that exists on the forum now</w:t>
             </w:r>
           </w:p>
         </w:tc>
@@ -11546,6 +11748,104 @@
                 <w:szCs w:val="19"/>
               </w:rPr>
               <w:t xml:space="preserve">Laptop, in ~/Projects/mulewatch</w:t>
+            </w:r>
+          </w:p>
+        </w:tc>
+      </w:tr>
+      <w:tr>
+        <w:trPr>
+          <w:cantSplit/>
+          <w:tblHeader w:val="false"/>
+        </w:trPr>
+        <w:tc>
+          <w:tcPr>
+            <w:tcW w:type="dxa" w:w="2600"/>
+            <w:tcBorders>
+              <w:top w:val="single" w:color="D5DBE7" w:sz="4"/>
+              <w:left w:val="single" w:color="D5DBE7" w:sz="4"/>
+              <w:bottom w:val="single" w:color="D5DBE7" w:sz="4"/>
+              <w:right w:val="single" w:color="D5DBE7" w:sz="4"/>
+            </w:tcBorders>
+            <w:tcMar>
+              <w:top w:type="dxa" w:w="70"/>
+              <w:left w:type="dxa" w:w="110"/>
+              <w:bottom w:type="dxa" w:w="70"/>
+              <w:right w:type="dxa" w:w="110"/>
+            </w:tcMar>
+          </w:tcPr>
+          <w:p>
+            <w:pPr>
+              <w:spacing w:after="30" w:line="260"/>
+            </w:pPr>
+            <w:r>
+              <w:rPr>
+                <w:rFonts w:ascii="Arial" w:cs="Arial" w:eastAsia="Arial" w:hAnsi="Arial"/>
+                <w:sz w:val="19"/>
+                <w:szCs w:val="19"/>
+              </w:rPr>
+              <w:t xml:space="preserve">Start on a specific port</w:t>
+            </w:r>
+          </w:p>
+        </w:tc>
+        <w:tc>
+          <w:tcPr>
+            <w:tcW w:type="dxa" w:w="4838"/>
+            <w:tcBorders>
+              <w:top w:val="single" w:color="D5DBE7" w:sz="4"/>
+              <w:left w:val="single" w:color="D5DBE7" w:sz="4"/>
+              <w:bottom w:val="single" w:color="D5DBE7" w:sz="4"/>
+              <w:right w:val="single" w:color="D5DBE7" w:sz="4"/>
+            </w:tcBorders>
+            <w:tcMar>
+              <w:top w:type="dxa" w:w="70"/>
+              <w:left w:type="dxa" w:w="110"/>
+              <w:bottom w:type="dxa" w:w="70"/>
+              <w:right w:type="dxa" w:w="110"/>
+            </w:tcMar>
+          </w:tcPr>
+          <w:p>
+            <w:pPr>
+              <w:spacing w:after="30" w:line="260"/>
+            </w:pPr>
+            <w:r>
+              <w:rPr>
+                <w:rFonts w:ascii="Consolas" w:cs="Consolas" w:eastAsia="Consolas" w:hAnsi="Consolas"/>
+                <w:color w:val="1F2A7A"/>
+                <w:sz w:val="18"/>
+                <w:szCs w:val="18"/>
+                <w:shd w:fill="EEF0F7" w:color="auto" w:val="clear"/>
+              </w:rPr>
+              <w:t xml:space="preserve">./run.sh --port 8010</w:t>
+            </w:r>
+          </w:p>
+        </w:tc>
+        <w:tc>
+          <w:tcPr>
+            <w:tcW w:type="dxa" w:w="2200"/>
+            <w:tcBorders>
+              <w:top w:val="single" w:color="D5DBE7" w:sz="4"/>
+              <w:left w:val="single" w:color="D5DBE7" w:sz="4"/>
+              <w:bottom w:val="single" w:color="D5DBE7" w:sz="4"/>
+              <w:right w:val="single" w:color="D5DBE7" w:sz="4"/>
+            </w:tcBorders>
+            <w:tcMar>
+              <w:top w:type="dxa" w:w="70"/>
+              <w:left w:type="dxa" w:w="110"/>
+              <w:bottom w:type="dxa" w:w="70"/>
+              <w:right w:type="dxa" w:w="110"/>
+            </w:tcMar>
+          </w:tcPr>
+          <w:p>
+            <w:pPr>
+              <w:spacing w:after="30" w:line="260"/>
+            </w:pPr>
+            <w:r>
+              <w:rPr>
+                <w:rFonts w:ascii="Arial" w:cs="Arial" w:eastAsia="Arial" w:hAnsi="Arial"/>
+                <w:sz w:val="19"/>
+                <w:szCs w:val="19"/>
+              </w:rPr>
+              <w:t xml:space="preserve">Laptop</w:t>
             </w:r>
           </w:p>
         </w:tc>

</xml_diff>

<commit_message>
Check any single link (post, ad, Telegram post, web page, image), monitor a single page, extension link/page checks
Co-Authored-By: Claude Opus 5.5 <noreply@anthropic.com>
Claude-Session: https://claude.ai/code/session_017kSrnrRRwV6yimEEKpq2Uf
</commit_message>
<xml_diff>
--- a/docs/MuleWatch_Demo_Guide.docx
+++ b/docs/MuleWatch_Demo_Guide.docx
@@ -1574,7 +1574,7 @@
                 <w:sz w:val="19"/>
                 <w:szCs w:val="19"/>
               </w:rPr>
-              <w:t xml:space="preserve">Live crawler every 3 s; reads schema.org JSON-LD that real forums publish; downloads attached images. Telegram public-channel crawler, Chrome extension and manual check page as extra inputs.</w:t>
+              <w:t xml:space="preserve">Live crawler every 3 s; reads schema.org JSON-LD that real forums publish; downloads attached images. Any single link (post, ad, Telegram post, web page, image) can be checked on demand or watched every minute. Telegram public-channel crawler and a Chrome extension as extra inputs.</w:t>
             </w:r>
           </w:p>
         </w:tc>
@@ -1604,7 +1604,7 @@
                 <w:sz w:val="19"/>
                 <w:szCs w:val="19"/>
               </w:rPr>
-              <w:t xml:space="preserve">Monitored sources page; Live intercepts feed</w:t>
+              <w:t xml:space="preserve">Monitored sources; Live intercepts; Check a post &gt; Link</w:t>
             </w:r>
           </w:p>
         </w:tc>
@@ -5947,7 +5947,7 @@
         <w:rPr>
           <w:rFonts w:ascii="Arial" w:cs="Arial" w:eastAsia="Arial" w:hAnsi="Arial"/>
         </w:rPr>
-        <w:t xml:space="preserve">Timings are approximate. Each step lists what to do, a suggested line to say, and what the judges will see.</w:t>
+        <w:t xml:space="preserve">Steps 7 and 8 are optional if time is short. Timings are approximate. Each step lists what to do, a suggested line to say, and what the judges will see.</w:t>
       </w:r>
     </w:p>
     <w:p>
@@ -8011,7 +8011,385 @@
         <w:rPr>
           <w:rFonts w:ascii="Arial" w:cs="Arial" w:eastAsia="Arial" w:hAnsi="Arial"/>
         </w:rPr>
-        <w:t xml:space="preserve">Step 7. Tricky cases and learning (30 s, if time allows)</w:t>
+        <w:t xml:space="preserve">Step 7. Check any link (30 s, optional)</w:t>
+      </w:r>
+    </w:p>
+    <w:tbl>
+      <w:tblPr>
+        <w:tblW w:type="dxa" w:w="9638"/>
+        <w:tblBorders>
+          <w:top w:val="single" w:color="auto" w:sz="4"/>
+          <w:left w:val="single" w:color="auto" w:sz="4"/>
+          <w:bottom w:val="single" w:color="auto" w:sz="4"/>
+          <w:right w:val="single" w:color="auto" w:sz="4"/>
+          <w:insideH w:val="single" w:color="auto" w:sz="4"/>
+          <w:insideV w:val="single" w:color="auto" w:sz="4"/>
+        </w:tblBorders>
+      </w:tblPr>
+      <w:tblGrid>
+        <w:gridCol w:w="1500"/>
+        <w:gridCol w:w="8138"/>
+      </w:tblGrid>
+      <w:tr>
+        <w:trPr>
+          <w:cantSplit/>
+        </w:trPr>
+        <w:tc>
+          <w:tcPr>
+            <w:tcW w:type="dxa" w:w="1500"/>
+            <w:tcBorders>
+              <w:top w:val="single" w:color="D5DBE7" w:sz="4"/>
+              <w:left w:val="single" w:color="D5DBE7" w:sz="4"/>
+              <w:bottom w:val="single" w:color="D5DBE7" w:sz="4"/>
+              <w:right w:val="single" w:color="D5DBE7" w:sz="4"/>
+            </w:tcBorders>
+            <w:shd w:fill="E8EBFA" w:color="auto" w:val="clear"/>
+            <w:tcMar>
+              <w:top w:type="dxa" w:w="70"/>
+              <w:left w:type="dxa" w:w="110"/>
+              <w:bottom w:type="dxa" w:w="70"/>
+              <w:right w:type="dxa" w:w="110"/>
+            </w:tcMar>
+          </w:tcPr>
+          <w:p>
+            <w:r>
+              <w:rPr>
+                <w:rFonts w:ascii="Arial" w:cs="Arial" w:eastAsia="Arial" w:hAnsi="Arial"/>
+                <w:b/>
+                <w:bCs/>
+                <w:sz w:val="19"/>
+                <w:szCs w:val="19"/>
+              </w:rPr>
+              <w:t xml:space="preserve">Do</w:t>
+            </w:r>
+          </w:p>
+        </w:tc>
+        <w:tc>
+          <w:tcPr>
+            <w:tcW w:type="dxa" w:w="8138"/>
+            <w:tcBorders>
+              <w:top w:val="single" w:color="D5DBE7" w:sz="4"/>
+              <w:left w:val="single" w:color="D5DBE7" w:sz="4"/>
+              <w:bottom w:val="single" w:color="D5DBE7" w:sz="4"/>
+              <w:right w:val="single" w:color="D5DBE7" w:sz="4"/>
+            </w:tcBorders>
+            <w:tcMar>
+              <w:top w:type="dxa" w:w="70"/>
+              <w:left w:type="dxa" w:w="110"/>
+              <w:bottom w:type="dxa" w:w="70"/>
+              <w:right w:type="dxa" w:w="110"/>
+            </w:tcMar>
+          </w:tcPr>
+          <w:p>
+            <w:pPr>
+              <w:spacing w:after="40" w:line="264"/>
+            </w:pPr>
+            <w:r>
+              <w:rPr>
+                <w:rFonts w:ascii="Arial" w:cs="Arial" w:eastAsia="Arial" w:hAnsi="Arial"/>
+                <w:sz w:val="19"/>
+                <w:szCs w:val="19"/>
+              </w:rPr>
+              <w:t xml:space="preserve">Open </w:t>
+            </w:r>
+            <w:r>
+              <w:rPr>
+                <w:rFonts w:ascii="Arial" w:cs="Arial" w:eastAsia="Arial" w:hAnsi="Arial"/>
+                <w:b/>
+                <w:bCs/>
+                <w:sz w:val="19"/>
+                <w:szCs w:val="19"/>
+              </w:rPr>
+              <w:t xml:space="preserve">Check a post</w:t>
+            </w:r>
+            <w:r>
+              <w:rPr>
+                <w:rFonts w:ascii="Arial" w:cs="Arial" w:eastAsia="Arial" w:hAnsi="Arial"/>
+                <w:sz w:val="19"/>
+                <w:szCs w:val="19"/>
+              </w:rPr>
+              <w:t xml:space="preserve">, keep the </w:t>
+            </w:r>
+            <w:r>
+              <w:rPr>
+                <w:rFonts w:ascii="Arial" w:cs="Arial" w:eastAsia="Arial" w:hAnsi="Arial"/>
+                <w:b/>
+                <w:bCs/>
+                <w:sz w:val="19"/>
+                <w:szCs w:val="19"/>
+              </w:rPr>
+              <w:t xml:space="preserve">Link</w:t>
+            </w:r>
+            <w:r>
+              <w:rPr>
+                <w:rFonts w:ascii="Arial" w:cs="Arial" w:eastAsia="Arial" w:hAnsi="Arial"/>
+                <w:sz w:val="19"/>
+                <w:szCs w:val="19"/>
+              </w:rPr>
+              <w:t xml:space="preserve"> tab, paste a link and click </w:t>
+            </w:r>
+            <w:r>
+              <w:rPr>
+                <w:rFonts w:ascii="Arial" w:cs="Arial" w:eastAsia="Arial" w:hAnsi="Arial"/>
+                <w:b/>
+                <w:bCs/>
+                <w:sz w:val="19"/>
+                <w:szCs w:val="19"/>
+              </w:rPr>
+              <w:t xml:space="preserve">Check post</w:t>
+            </w:r>
+            <w:r>
+              <w:rPr>
+                <w:rFonts w:ascii="Arial" w:cs="Arial" w:eastAsia="Arial" w:hAnsi="Arial"/>
+                <w:sz w:val="19"/>
+                <w:szCs w:val="19"/>
+              </w:rPr>
+              <w:t xml:space="preserve">. Good choices: a forum post link such as http://103.155.85.18:8100/p/5, a public Telegram post (t.me/channel/123), or any public ad page.</w:t>
+            </w:r>
+          </w:p>
+          <w:p>
+            <w:pPr>
+              <w:spacing w:after="40" w:line="264"/>
+            </w:pPr>
+            <w:r>
+              <w:rPr>
+                <w:rFonts w:ascii="Arial" w:cs="Arial" w:eastAsia="Arial" w:hAnsi="Arial"/>
+                <w:sz w:val="19"/>
+                <w:szCs w:val="19"/>
+              </w:rPr>
+              <w:t xml:space="preserve">Optionally right-click a link on any website and choose </w:t>
+            </w:r>
+            <w:r>
+              <w:rPr>
+                <w:rFonts w:ascii="Arial" w:cs="Arial" w:eastAsia="Arial" w:hAnsi="Arial"/>
+                <w:b/>
+                <w:bCs/>
+                <w:sz w:val="19"/>
+                <w:szCs w:val="19"/>
+              </w:rPr>
+              <w:t xml:space="preserve">Check this link with MuleWatch</w:t>
+            </w:r>
+            <w:r>
+              <w:rPr>
+                <w:rFonts w:ascii="Arial" w:cs="Arial" w:eastAsia="Arial" w:hAnsi="Arial"/>
+                <w:sz w:val="19"/>
+                <w:szCs w:val="19"/>
+              </w:rPr>
+              <w:t xml:space="preserve"> (Chrome extension).</w:t>
+            </w:r>
+          </w:p>
+        </w:tc>
+      </w:tr>
+      <w:tr>
+        <w:trPr>
+          <w:cantSplit/>
+        </w:trPr>
+        <w:tc>
+          <w:tcPr>
+            <w:tcW w:type="dxa" w:w="1500"/>
+            <w:tcBorders>
+              <w:top w:val="single" w:color="D5DBE7" w:sz="4"/>
+              <w:left w:val="single" w:color="D5DBE7" w:sz="4"/>
+              <w:bottom w:val="single" w:color="D5DBE7" w:sz="4"/>
+              <w:right w:val="single" w:color="D5DBE7" w:sz="4"/>
+            </w:tcBorders>
+            <w:shd w:fill="F1F8F4" w:color="auto" w:val="clear"/>
+            <w:tcMar>
+              <w:top w:type="dxa" w:w="70"/>
+              <w:left w:type="dxa" w:w="110"/>
+              <w:bottom w:type="dxa" w:w="70"/>
+              <w:right w:type="dxa" w:w="110"/>
+            </w:tcMar>
+          </w:tcPr>
+          <w:p>
+            <w:r>
+              <w:rPr>
+                <w:rFonts w:ascii="Arial" w:cs="Arial" w:eastAsia="Arial" w:hAnsi="Arial"/>
+                <w:b/>
+                <w:bCs/>
+                <w:sz w:val="19"/>
+                <w:szCs w:val="19"/>
+              </w:rPr>
+              <w:t xml:space="preserve">Say</w:t>
+            </w:r>
+          </w:p>
+        </w:tc>
+        <w:tc>
+          <w:tcPr>
+            <w:tcW w:type="dxa" w:w="8138"/>
+            <w:tcBorders>
+              <w:top w:val="single" w:color="D5DBE7" w:sz="4"/>
+              <w:left w:val="single" w:color="D5DBE7" w:sz="4"/>
+              <w:bottom w:val="single" w:color="D5DBE7" w:sz="4"/>
+              <w:right w:val="single" w:color="D5DBE7" w:sz="4"/>
+            </w:tcBorders>
+            <w:tcMar>
+              <w:top w:type="dxa" w:w="70"/>
+              <w:left w:type="dxa" w:w="110"/>
+              <w:bottom w:type="dxa" w:w="70"/>
+              <w:right w:type="dxa" w:w="110"/>
+            </w:tcMar>
+          </w:tcPr>
+          <w:p>
+            <w:pPr>
+              <w:spacing w:after="40" w:line="264"/>
+            </w:pPr>
+            <w:r>
+              <w:rPr>
+                <w:rFonts w:ascii="Arial" w:cs="Arial" w:eastAsia="Arial" w:hAnsi="Arial"/>
+                <w:sz w:val="19"/>
+                <w:szCs w:val="19"/>
+              </w:rPr>
+              <w:t xml:space="preserve">"Investigators don't only watch feeds; they get tip-offs. Paste any link and MuleWatch reads the page, its preview data and its pictures, and tells you in seconds whether it's selling accounts, and whether it's linked to a known seller."</w:t>
+            </w:r>
+          </w:p>
+        </w:tc>
+      </w:tr>
+      <w:tr>
+        <w:trPr>
+          <w:cantSplit/>
+        </w:trPr>
+        <w:tc>
+          <w:tcPr>
+            <w:tcW w:type="dxa" w:w="1500"/>
+            <w:tcBorders>
+              <w:top w:val="single" w:color="D5DBE7" w:sz="4"/>
+              <w:left w:val="single" w:color="D5DBE7" w:sz="4"/>
+              <w:bottom w:val="single" w:color="D5DBE7" w:sz="4"/>
+              <w:right w:val="single" w:color="D5DBE7" w:sz="4"/>
+            </w:tcBorders>
+            <w:shd w:fill="FDF3E7" w:color="auto" w:val="clear"/>
+            <w:tcMar>
+              <w:top w:type="dxa" w:w="70"/>
+              <w:left w:type="dxa" w:w="110"/>
+              <w:bottom w:type="dxa" w:w="70"/>
+              <w:right w:type="dxa" w:w="110"/>
+            </w:tcMar>
+          </w:tcPr>
+          <w:p>
+            <w:r>
+              <w:rPr>
+                <w:rFonts w:ascii="Arial" w:cs="Arial" w:eastAsia="Arial" w:hAnsi="Arial"/>
+                <w:b/>
+                <w:bCs/>
+                <w:sz w:val="19"/>
+                <w:szCs w:val="19"/>
+              </w:rPr>
+              <w:t xml:space="preserve">Judges see</w:t>
+            </w:r>
+          </w:p>
+        </w:tc>
+        <w:tc>
+          <w:tcPr>
+            <w:tcW w:type="dxa" w:w="8138"/>
+            <w:tcBorders>
+              <w:top w:val="single" w:color="D5DBE7" w:sz="4"/>
+              <w:left w:val="single" w:color="D5DBE7" w:sz="4"/>
+              <w:bottom w:val="single" w:color="D5DBE7" w:sz="4"/>
+              <w:right w:val="single" w:color="D5DBE7" w:sz="4"/>
+            </w:tcBorders>
+            <w:tcMar>
+              <w:top w:type="dxa" w:w="70"/>
+              <w:left w:type="dxa" w:w="110"/>
+              <w:bottom w:type="dxa" w:w="70"/>
+              <w:right w:type="dxa" w:w="110"/>
+            </w:tcMar>
+          </w:tcPr>
+          <w:p>
+            <w:pPr>
+              <w:spacing w:after="40" w:line="264"/>
+            </w:pPr>
+            <w:r>
+              <w:rPr>
+                <w:rFonts w:ascii="Arial" w:cs="Arial" w:eastAsia="Arial" w:hAnsi="Arial"/>
+                <w:sz w:val="19"/>
+                <w:szCs w:val="19"/>
+              </w:rPr>
+              <w:t xml:space="preserve">A note saying where the content was read from, the verdict and score, "linked to N other posts" when it shares a phone, UPI or Telegram handle with a known ring, and the same evidence view as a case.</w:t>
+            </w:r>
+          </w:p>
+        </w:tc>
+      </w:tr>
+    </w:tbl>
+    <w:p>
+      <w:pPr>
+        <w:spacing w:after="160"/>
+      </w:pPr>
+    </w:p>
+    <w:p>
+      <w:pPr>
+        <w:keepNext/>
+        <w:spacing w:after="40" w:before="80"/>
+        <w:jc w:val="center"/>
+      </w:pPr>
+      <w:r>
+        <w:drawing>
+          <wp:inline distT="0" distB="0" distL="0" distR="0">
+            <wp:extent cx="5334000" cy="3648075"/>
+            <wp:effectExtent t="0" r="0" b="0" l="0"/>
+            <wp:docPr id="1" name="analyze_crop.png" descr="Checking a single link: content read from the page and its image, scored and linked to a known ring" title="Checking a single link: content read from the page and its image, scored and linked to a known ring"/>
+            <wp:cNvGraphicFramePr>
+              <a:graphicFrameLocks xmlns:a="http://schemas.openxmlformats.org/drawingml/2006/main" noChangeAspect="1"/>
+            </wp:cNvGraphicFramePr>
+            <a:graphic xmlns:a="http://schemas.openxmlformats.org/drawingml/2006/main">
+              <a:graphicData uri="http://schemas.openxmlformats.org/drawingml/2006/picture">
+                <pic:pic xmlns:pic="http://schemas.openxmlformats.org/drawingml/2006/picture">
+                  <pic:nvPicPr>
+                    <pic:cNvPr id="0" name="" descr=""/>
+                    <pic:cNvPicPr>
+                      <a:picLocks noChangeAspect="1" noChangeArrowheads="1"/>
+                    </pic:cNvPicPr>
+                  </pic:nvPicPr>
+                  <pic:blipFill>
+                    <a:blip r:embed="rId15" cstate="none"/>
+                    <a:srcRect/>
+                    <a:stretch>
+                      <a:fillRect/>
+                    </a:stretch>
+                  </pic:blipFill>
+                  <pic:spPr bwMode="auto">
+                    <a:xfrm>
+                      <a:off x="0" y="0"/>
+                      <a:ext cx="5334000" cy="3648075"/>
+                    </a:xfrm>
+                    <a:prstGeom prst="rect">
+                      <a:avLst/>
+                    </a:prstGeom>
+                  </pic:spPr>
+                </pic:pic>
+              </a:graphicData>
+            </a:graphic>
+          </wp:inline>
+        </w:drawing>
+      </w:r>
+    </w:p>
+    <w:p>
+      <w:pPr>
+        <w:spacing w:after="200"/>
+        <w:jc w:val="center"/>
+      </w:pPr>
+      <w:r>
+        <w:rPr>
+          <w:rFonts w:ascii="Arial" w:cs="Arial" w:eastAsia="Arial" w:hAnsi="Arial"/>
+          <w:i/>
+          <w:iCs/>
+          <w:color w:val="5B6478"/>
+          <w:sz w:val="18"/>
+          <w:szCs w:val="18"/>
+        </w:rPr>
+        <w:t xml:space="preserve">Checking a single link: content read from the page and its image, scored and linked to a known ring</w:t>
+      </w:r>
+    </w:p>
+    <w:p>
+      <w:pPr>
+        <w:pStyle w:val="Heading3"/>
+        <w:keepNext/>
+      </w:pPr>
+      <w:r>
+        <w:rPr>
+          <w:rFonts w:ascii="Arial" w:cs="Arial" w:eastAsia="Arial" w:hAnsi="Arial"/>
+        </w:rPr>
+        <w:t xml:space="preserve">Step 8. Tricky cases and learning (30 s, if time allows)</w:t>
       </w:r>
     </w:p>
     <w:tbl>
@@ -9490,6 +9868,162 @@
                 <w:sz w:val="19"/>
                 <w:szCs w:val="19"/>
               </w:rPr>
+              <w:t xml:space="preserve">H</w:t>
+            </w:r>
+          </w:p>
+        </w:tc>
+        <w:tc>
+          <w:tcPr>
+            <w:tcW w:type="dxa" w:w="1500"/>
+            <w:tcBorders>
+              <w:top w:val="single" w:color="D5DBE7" w:sz="4"/>
+              <w:left w:val="single" w:color="D5DBE7" w:sz="4"/>
+              <w:bottom w:val="single" w:color="D5DBE7" w:sz="4"/>
+              <w:right w:val="single" w:color="D5DBE7" w:sz="4"/>
+            </w:tcBorders>
+            <w:tcMar>
+              <w:top w:type="dxa" w:w="70"/>
+              <w:left w:type="dxa" w:w="110"/>
+              <w:bottom w:type="dxa" w:w="70"/>
+              <w:right w:type="dxa" w:w="110"/>
+            </w:tcMar>
+          </w:tcPr>
+          <w:p>
+            <w:pPr>
+              <w:spacing w:after="30" w:line="260"/>
+            </w:pPr>
+            <w:r>
+              <w:rPr>
+                <w:rFonts w:ascii="Arial" w:cs="Arial" w:eastAsia="Arial" w:hAnsi="Arial"/>
+                <w:sz w:val="19"/>
+                <w:szCs w:val="19"/>
+              </w:rPr>
+              <w:t xml:space="preserve">Check a post &gt; Link</w:t>
+            </w:r>
+          </w:p>
+        </w:tc>
+        <w:tc>
+          <w:tcPr>
+            <w:tcW w:type="dxa" w:w="2100"/>
+            <w:tcBorders>
+              <w:top w:val="single" w:color="D5DBE7" w:sz="4"/>
+              <w:left w:val="single" w:color="D5DBE7" w:sz="4"/>
+              <w:bottom w:val="single" w:color="D5DBE7" w:sz="4"/>
+              <w:right w:val="single" w:color="D5DBE7" w:sz="4"/>
+            </w:tcBorders>
+            <w:tcMar>
+              <w:top w:type="dxa" w:w="70"/>
+              <w:left w:type="dxa" w:w="110"/>
+              <w:bottom w:type="dxa" w:w="70"/>
+              <w:right w:type="dxa" w:w="110"/>
+            </w:tcMar>
+          </w:tcPr>
+          <w:p>
+            <w:pPr>
+              <w:spacing w:after="30" w:line="260"/>
+            </w:pPr>
+            <w:r>
+              <w:rPr>
+                <w:rFonts w:ascii="Arial" w:cs="Arial" w:eastAsia="Arial" w:hAnsi="Arial"/>
+                <w:sz w:val="19"/>
+                <w:szCs w:val="19"/>
+              </w:rPr>
+              <w:t xml:space="preserve">(any link)</w:t>
+            </w:r>
+          </w:p>
+        </w:tc>
+        <w:tc>
+          <w:tcPr>
+            <w:tcW w:type="dxa" w:w="3538"/>
+            <w:tcBorders>
+              <w:top w:val="single" w:color="D5DBE7" w:sz="4"/>
+              <w:left w:val="single" w:color="D5DBE7" w:sz="4"/>
+              <w:bottom w:val="single" w:color="D5DBE7" w:sz="4"/>
+              <w:right w:val="single" w:color="D5DBE7" w:sz="4"/>
+            </w:tcBorders>
+            <w:tcMar>
+              <w:top w:type="dxa" w:w="70"/>
+              <w:left w:type="dxa" w:w="110"/>
+              <w:bottom w:type="dxa" w:w="70"/>
+              <w:right w:type="dxa" w:w="110"/>
+            </w:tcMar>
+          </w:tcPr>
+          <w:p>
+            <w:pPr>
+              <w:spacing w:after="30" w:line="260"/>
+            </w:pPr>
+            <w:r>
+              <w:rPr>
+                <w:rFonts w:ascii="Arial" w:cs="Arial" w:eastAsia="Arial" w:hAnsi="Arial"/>
+                <w:sz w:val="19"/>
+                <w:szCs w:val="19"/>
+              </w:rPr>
+              <w:t xml:space="preserve">http://103.155.85.18:8100/p/5  or a public t.me/channel/123 post  or any public ad page</w:t>
+            </w:r>
+          </w:p>
+        </w:tc>
+        <w:tc>
+          <w:tcPr>
+            <w:tcW w:type="dxa" w:w="2000"/>
+            <w:tcBorders>
+              <w:top w:val="single" w:color="D5DBE7" w:sz="4"/>
+              <w:left w:val="single" w:color="D5DBE7" w:sz="4"/>
+              <w:bottom w:val="single" w:color="D5DBE7" w:sz="4"/>
+              <w:right w:val="single" w:color="D5DBE7" w:sz="4"/>
+            </w:tcBorders>
+            <w:tcMar>
+              <w:top w:type="dxa" w:w="70"/>
+              <w:left w:type="dxa" w:w="110"/>
+              <w:bottom w:type="dxa" w:w="70"/>
+              <w:right w:type="dxa" w:w="110"/>
+            </w:tcMar>
+          </w:tcPr>
+          <w:p>
+            <w:pPr>
+              <w:spacing w:after="30" w:line="260"/>
+            </w:pPr>
+            <w:r>
+              <w:rPr>
+                <w:rFonts w:ascii="Arial" w:cs="Arial" w:eastAsia="Arial" w:hAnsi="Arial"/>
+                <w:sz w:val="19"/>
+                <w:szCs w:val="19"/>
+              </w:rPr>
+              <w:t xml:space="preserve">Score and evidence for that page; linked to a ring if it shares identifiers</w:t>
+            </w:r>
+          </w:p>
+        </w:tc>
+      </w:tr>
+      <w:tr>
+        <w:trPr>
+          <w:cantSplit/>
+          <w:tblHeader w:val="false"/>
+        </w:trPr>
+        <w:tc>
+          <w:tcPr>
+            <w:tcW w:type="dxa" w:w="500"/>
+            <w:tcBorders>
+              <w:top w:val="single" w:color="D5DBE7" w:sz="4"/>
+              <w:left w:val="single" w:color="D5DBE7" w:sz="4"/>
+              <w:bottom w:val="single" w:color="D5DBE7" w:sz="4"/>
+              <w:right w:val="single" w:color="D5DBE7" w:sz="4"/>
+            </w:tcBorders>
+            <w:tcMar>
+              <w:top w:type="dxa" w:w="70"/>
+              <w:left w:type="dxa" w:w="110"/>
+              <w:bottom w:type="dxa" w:w="70"/>
+              <w:right w:type="dxa" w:w="110"/>
+            </w:tcMar>
+          </w:tcPr>
+          <w:p>
+            <w:pPr>
+              <w:spacing w:after="30" w:line="260"/>
+            </w:pPr>
+            <w:r>
+              <w:rPr>
+                <w:rFonts w:ascii="Arial" w:cs="Arial" w:eastAsia="Arial" w:hAnsi="Arial"/>
+                <w:sz w:val="19"/>
+                <w:szCs w:val="19"/>
+              </w:rPr>
               <w:t xml:space="preserve">G</w:t>
             </w:r>
           </w:p>
@@ -11116,6 +11650,198 @@
                 <w:sz w:val="19"/>
                 <w:szCs w:val="19"/>
               </w:rPr>
+              <w:t xml:space="preserve">Link check says login required, or shows little text</w:t>
+            </w:r>
+          </w:p>
+        </w:tc>
+        <w:tc>
+          <w:tcPr>
+            <w:tcW w:type="dxa" w:w="2600"/>
+            <w:tcBorders>
+              <w:top w:val="single" w:color="D5DBE7" w:sz="4"/>
+              <w:left w:val="single" w:color="D5DBE7" w:sz="4"/>
+              <w:bottom w:val="single" w:color="D5DBE7" w:sz="4"/>
+              <w:right w:val="single" w:color="D5DBE7" w:sz="4"/>
+            </w:tcBorders>
+            <w:tcMar>
+              <w:top w:type="dxa" w:w="70"/>
+              <w:left w:type="dxa" w:w="110"/>
+              <w:bottom w:type="dxa" w:w="70"/>
+              <w:right w:type="dxa" w:w="110"/>
+            </w:tcMar>
+          </w:tcPr>
+          <w:p>
+            <w:pPr>
+              <w:spacing w:after="30" w:line="260"/>
+            </w:pPr>
+            <w:r>
+              <w:rPr>
+                <w:rFonts w:ascii="Arial" w:cs="Arial" w:eastAsia="Arial" w:hAnsi="Arial"/>
+                <w:sz w:val="19"/>
+                <w:szCs w:val="19"/>
+              </w:rPr>
+              <w:t xml:space="preserve">Facebook, Instagram and WhatsApp hide posts from logged-out visitors</w:t>
+            </w:r>
+          </w:p>
+        </w:tc>
+        <w:tc>
+          <w:tcPr>
+            <w:tcW w:type="dxa" w:w="4338"/>
+            <w:tcBorders>
+              <w:top w:val="single" w:color="D5DBE7" w:sz="4"/>
+              <w:left w:val="single" w:color="D5DBE7" w:sz="4"/>
+              <w:bottom w:val="single" w:color="D5DBE7" w:sz="4"/>
+              <w:right w:val="single" w:color="D5DBE7" w:sz="4"/>
+            </w:tcBorders>
+            <w:tcMar>
+              <w:top w:type="dxa" w:w="70"/>
+              <w:left w:type="dxa" w:w="110"/>
+              <w:bottom w:type="dxa" w:w="70"/>
+              <w:right w:type="dxa" w:w="110"/>
+            </w:tcMar>
+          </w:tcPr>
+          <w:p>
+            <w:pPr>
+              <w:spacing w:after="30" w:line="260"/>
+            </w:pPr>
+            <w:r>
+              <w:rPr>
+                <w:rFonts w:ascii="Arial" w:cs="Arial" w:eastAsia="Arial" w:hAnsi="Arial"/>
+                <w:sz w:val="19"/>
+                <w:szCs w:val="19"/>
+              </w:rPr>
+              <w:t xml:space="preserve">Open the post in Chrome and use the extension's Check this page, or paste the text and a screenshot</w:t>
+            </w:r>
+          </w:p>
+        </w:tc>
+      </w:tr>
+      <w:tr>
+        <w:trPr>
+          <w:cantSplit/>
+          <w:tblHeader w:val="false"/>
+        </w:trPr>
+        <w:tc>
+          <w:tcPr>
+            <w:tcW w:type="dxa" w:w="2700"/>
+            <w:tcBorders>
+              <w:top w:val="single" w:color="D5DBE7" w:sz="4"/>
+              <w:left w:val="single" w:color="D5DBE7" w:sz="4"/>
+              <w:bottom w:val="single" w:color="D5DBE7" w:sz="4"/>
+              <w:right w:val="single" w:color="D5DBE7" w:sz="4"/>
+            </w:tcBorders>
+            <w:tcMar>
+              <w:top w:type="dxa" w:w="70"/>
+              <w:left w:type="dxa" w:w="110"/>
+              <w:bottom w:type="dxa" w:w="70"/>
+              <w:right w:type="dxa" w:w="110"/>
+            </w:tcMar>
+          </w:tcPr>
+          <w:p>
+            <w:pPr>
+              <w:spacing w:after="30" w:line="260"/>
+            </w:pPr>
+            <w:r>
+              <w:rPr>
+                <w:rFonts w:ascii="Arial" w:cs="Arial" w:eastAsia="Arial" w:hAnsi="Arial"/>
+                <w:sz w:val="19"/>
+                <w:szCs w:val="19"/>
+              </w:rPr>
+              <w:t xml:space="preserve">Link check refuses a local address</w:t>
+            </w:r>
+          </w:p>
+        </w:tc>
+        <w:tc>
+          <w:tcPr>
+            <w:tcW w:type="dxa" w:w="2600"/>
+            <w:tcBorders>
+              <w:top w:val="single" w:color="D5DBE7" w:sz="4"/>
+              <w:left w:val="single" w:color="D5DBE7" w:sz="4"/>
+              <w:bottom w:val="single" w:color="D5DBE7" w:sz="4"/>
+              <w:right w:val="single" w:color="D5DBE7" w:sz="4"/>
+            </w:tcBorders>
+            <w:tcMar>
+              <w:top w:type="dxa" w:w="70"/>
+              <w:left w:type="dxa" w:w="110"/>
+              <w:bottom w:type="dxa" w:w="70"/>
+              <w:right w:type="dxa" w:w="110"/>
+            </w:tcMar>
+          </w:tcPr>
+          <w:p>
+            <w:pPr>
+              <w:spacing w:after="30" w:line="260"/>
+            </w:pPr>
+            <w:r>
+              <w:rPr>
+                <w:rFonts w:ascii="Arial" w:cs="Arial" w:eastAsia="Arial" w:hAnsi="Arial"/>
+                <w:sz w:val="19"/>
+                <w:szCs w:val="19"/>
+              </w:rPr>
+              <w:t xml:space="preserve">Links into private networks are blocked for safety (only the demo forum is allowed)</w:t>
+            </w:r>
+          </w:p>
+        </w:tc>
+        <w:tc>
+          <w:tcPr>
+            <w:tcW w:type="dxa" w:w="4338"/>
+            <w:tcBorders>
+              <w:top w:val="single" w:color="D5DBE7" w:sz="4"/>
+              <w:left w:val="single" w:color="D5DBE7" w:sz="4"/>
+              <w:bottom w:val="single" w:color="D5DBE7" w:sz="4"/>
+              <w:right w:val="single" w:color="D5DBE7" w:sz="4"/>
+            </w:tcBorders>
+            <w:tcMar>
+              <w:top w:type="dxa" w:w="70"/>
+              <w:left w:type="dxa" w:w="110"/>
+              <w:bottom w:type="dxa" w:w="70"/>
+              <w:right w:type="dxa" w:w="110"/>
+            </w:tcMar>
+          </w:tcPr>
+          <w:p>
+            <w:pPr>
+              <w:spacing w:after="30" w:line="260"/>
+            </w:pPr>
+            <w:r>
+              <w:rPr>
+                <w:rFonts w:ascii="Arial" w:cs="Arial" w:eastAsia="Arial" w:hAnsi="Arial"/>
+                <w:sz w:val="19"/>
+                <w:szCs w:val="19"/>
+              </w:rPr>
+              <w:t xml:space="preserve">Use the public address of the page</w:t>
+            </w:r>
+          </w:p>
+        </w:tc>
+      </w:tr>
+      <w:tr>
+        <w:trPr>
+          <w:cantSplit/>
+          <w:tblHeader w:val="false"/>
+        </w:trPr>
+        <w:tc>
+          <w:tcPr>
+            <w:tcW w:type="dxa" w:w="2700"/>
+            <w:tcBorders>
+              <w:top w:val="single" w:color="D5DBE7" w:sz="4"/>
+              <w:left w:val="single" w:color="D5DBE7" w:sz="4"/>
+              <w:bottom w:val="single" w:color="D5DBE7" w:sz="4"/>
+              <w:right w:val="single" w:color="D5DBE7" w:sz="4"/>
+            </w:tcBorders>
+            <w:tcMar>
+              <w:top w:type="dxa" w:w="70"/>
+              <w:left w:type="dxa" w:w="110"/>
+              <w:bottom w:type="dxa" w:w="70"/>
+              <w:right w:type="dxa" w:w="110"/>
+            </w:tcMar>
+          </w:tcPr>
+          <w:p>
+            <w:pPr>
+              <w:spacing w:after="30" w:line="260"/>
+            </w:pPr>
+            <w:r>
+              <w:rPr>
+                <w:rFonts w:ascii="Arial" w:cs="Arial" w:eastAsia="Arial" w:hAnsi="Arial"/>
+                <w:sz w:val="19"/>
+                <w:szCs w:val="19"/>
+              </w:rPr>
               <w:t xml:space="preserve">Request takedown says the post is no longer on the forum</w:t>
             </w:r>
           </w:p>
@@ -11816,6 +12542,104 @@
                 <w:shd w:fill="EEF0F7" w:color="auto" w:val="clear"/>
               </w:rPr>
               <w:t xml:space="preserve">./run.sh --port 8010</w:t>
+            </w:r>
+          </w:p>
+        </w:tc>
+        <w:tc>
+          <w:tcPr>
+            <w:tcW w:type="dxa" w:w="2200"/>
+            <w:tcBorders>
+              <w:top w:val="single" w:color="D5DBE7" w:sz="4"/>
+              <w:left w:val="single" w:color="D5DBE7" w:sz="4"/>
+              <w:bottom w:val="single" w:color="D5DBE7" w:sz="4"/>
+              <w:right w:val="single" w:color="D5DBE7" w:sz="4"/>
+            </w:tcBorders>
+            <w:tcMar>
+              <w:top w:type="dxa" w:w="70"/>
+              <w:left w:type="dxa" w:w="110"/>
+              <w:bottom w:type="dxa" w:w="70"/>
+              <w:right w:type="dxa" w:w="110"/>
+            </w:tcMar>
+          </w:tcPr>
+          <w:p>
+            <w:pPr>
+              <w:spacing w:after="30" w:line="260"/>
+            </w:pPr>
+            <w:r>
+              <w:rPr>
+                <w:rFonts w:ascii="Arial" w:cs="Arial" w:eastAsia="Arial" w:hAnsi="Arial"/>
+                <w:sz w:val="19"/>
+                <w:szCs w:val="19"/>
+              </w:rPr>
+              <w:t xml:space="preserve">Laptop</w:t>
+            </w:r>
+          </w:p>
+        </w:tc>
+      </w:tr>
+      <w:tr>
+        <w:trPr>
+          <w:cantSplit/>
+          <w:tblHeader w:val="false"/>
+        </w:trPr>
+        <w:tc>
+          <w:tcPr>
+            <w:tcW w:type="dxa" w:w="2600"/>
+            <w:tcBorders>
+              <w:top w:val="single" w:color="D5DBE7" w:sz="4"/>
+              <w:left w:val="single" w:color="D5DBE7" w:sz="4"/>
+              <w:bottom w:val="single" w:color="D5DBE7" w:sz="4"/>
+              <w:right w:val="single" w:color="D5DBE7" w:sz="4"/>
+            </w:tcBorders>
+            <w:tcMar>
+              <w:top w:type="dxa" w:w="70"/>
+              <w:left w:type="dxa" w:w="110"/>
+              <w:bottom w:type="dxa" w:w="70"/>
+              <w:right w:type="dxa" w:w="110"/>
+            </w:tcMar>
+          </w:tcPr>
+          <w:p>
+            <w:pPr>
+              <w:spacing w:after="30" w:line="260"/>
+            </w:pPr>
+            <w:r>
+              <w:rPr>
+                <w:rFonts w:ascii="Arial" w:cs="Arial" w:eastAsia="Arial" w:hAnsi="Arial"/>
+                <w:sz w:val="19"/>
+                <w:szCs w:val="19"/>
+              </w:rPr>
+              <w:t xml:space="preserve">Check a link from the terminal</w:t>
+            </w:r>
+          </w:p>
+        </w:tc>
+        <w:tc>
+          <w:tcPr>
+            <w:tcW w:type="dxa" w:w="4838"/>
+            <w:tcBorders>
+              <w:top w:val="single" w:color="D5DBE7" w:sz="4"/>
+              <w:left w:val="single" w:color="D5DBE7" w:sz="4"/>
+              <w:bottom w:val="single" w:color="D5DBE7" w:sz="4"/>
+              <w:right w:val="single" w:color="D5DBE7" w:sz="4"/>
+            </w:tcBorders>
+            <w:tcMar>
+              <w:top w:type="dxa" w:w="70"/>
+              <w:left w:type="dxa" w:w="110"/>
+              <w:bottom w:type="dxa" w:w="70"/>
+              <w:right w:type="dxa" w:w="110"/>
+            </w:tcMar>
+          </w:tcPr>
+          <w:p>
+            <w:pPr>
+              <w:spacing w:after="30" w:line="260"/>
+            </w:pPr>
+            <w:r>
+              <w:rPr>
+                <w:rFonts w:ascii="Consolas" w:cs="Consolas" w:eastAsia="Consolas" w:hAnsi="Consolas"/>
+                <w:color w:val="1F2A7A"/>
+                <w:sz w:val="18"/>
+                <w:szCs w:val="18"/>
+                <w:shd w:fill="EEF0F7" w:color="auto" w:val="clear"/>
+              </w:rPr>
+              <w:t xml:space="preserve">curl -X POST localhost:8000/api/analyze/url -H 'Content-Type: application/json' -d '{"url":"https://t.me/channel/123","save":false}'</w:t>
             </w:r>
           </w:p>
         </w:tc>

</xml_diff>

<commit_message>
Scan forum comments: each comment scored as its own case, comment takedown, easy-money lure rules, seeded scam comments
Co-Authored-By: Claude Opus 5.5 <noreply@anthropic.com>
Claude-Session: https://claude.ai/code/session_017kSrnrRRwV6yimEEKpq2Uf
</commit_message>
<xml_diff>
--- a/docs/MuleWatch_Demo_Guide.docx
+++ b/docs/MuleWatch_Demo_Guide.docx
@@ -1574,7 +1574,7 @@
                 <w:sz w:val="19"/>
                 <w:szCs w:val="19"/>
               </w:rPr>
-              <w:t xml:space="preserve">Live crawler every 3 s; reads schema.org JSON-LD that real forums publish; downloads attached images. Any single link (post, ad, Telegram post, web page, image) can be checked on demand or watched every minute. Telegram public-channel crawler and a Chrome extension as extra inputs.</w:t>
+              <w:t xml:space="preserve">Live crawler every 3 s reads every new post and every new comment from the schema.org JSON-LD that real forums publish, and downloads attached images. Any single link (post, ad, Telegram post, web page, image) can be checked on demand or watched every minute. Telegram public-channel crawler and a Chrome extension as extra inputs.</w:t>
             </w:r>
           </w:p>
         </w:tc>
@@ -4254,7 +4254,7 @@
         <w:rPr>
           <w:rFonts w:ascii="Arial" w:cs="Arial" w:eastAsia="Arial" w:hAnsi="Arial"/>
         </w:rPr>
-        <w:t xml:space="preserve">, seeds the 50 posts, creates a systemd service called </w:t>
+        <w:t xml:space="preserve">, seeds the 50 posts and their comments, creates a systemd service called </w:t>
       </w:r>
       <w:r>
         <w:rPr>
@@ -5343,7 +5343,7 @@
                 <w:sz w:val="19"/>
                 <w:szCs w:val="19"/>
               </w:rPr>
-              <w:t xml:space="preserve">50 posts scanned, 16 critical, 4 seller rings</w:t>
+              <w:t xml:space="preserve">67 posts and comments scanned, 18 critical, 1 high, 4 seller rings</w:t>
             </w:r>
           </w:p>
         </w:tc>
@@ -5373,7 +5373,7 @@
                 <w:sz w:val="19"/>
                 <w:szCs w:val="19"/>
               </w:rPr>
-              <w:t xml:space="preserve">Wait one minute; if posts scanned is above 50, reset the forum (4.1)</w:t>
+              <w:t xml:space="preserve">Wait one minute; if the scanned count is above 67, reset the forum (4.1)</w:t>
             </w:r>
           </w:p>
         </w:tc>
@@ -6121,7 +6121,7 @@
                 <w:sz w:val="19"/>
                 <w:szCs w:val="19"/>
               </w:rPr>
-              <w:t xml:space="preserve">"Money-mule accounts are bought and rented openly on social media. MuleWatch watches public platforms in real time. It has already scanned 50 posts on this forum, flagged 16 as critical, and found 4 seller networks, without a single false alarm on the 34 normal posts."</w:t>
+              <w:t xml:space="preserve">"Money-mule accounts are bought and rented openly on social media. MuleWatch watches public platforms in real time. It has already scanned 50 posts and 17 comments on this forum, flagged 19 of them, and found 4 seller networks, without a single false alarm on the 48 normal ones. It even caught sellers hiding their ads in the comments of ordinary posts."</w:t>
             </w:r>
           </w:p>
         </w:tc>
@@ -6186,7 +6186,7 @@
                 <w:sz w:val="19"/>
                 <w:szCs w:val="19"/>
               </w:rPr>
-              <w:t xml:space="preserve">Dashboard with 50 scanned, 16 critical, 4 rings; red Critical rows in the live feed.</w:t>
+              <w:t xml:space="preserve">Dashboard with 67 scanned, 18 critical, 1 high, 4 rings; red Critical rows in the live feed, some tagged comment.</w:t>
             </w:r>
           </w:p>
         </w:tc>
@@ -6931,6 +6931,271 @@
         <w:rPr>
           <w:rFonts w:ascii="Arial" w:cs="Arial" w:eastAsia="Arial" w:hAnsi="Arial"/>
         </w:rPr>
+        <w:t xml:space="preserve">Step 3b. A scam hidden in a comment (30 s)</w:t>
+      </w:r>
+    </w:p>
+    <w:tbl>
+      <w:tblPr>
+        <w:tblW w:type="dxa" w:w="9638"/>
+        <w:tblBorders>
+          <w:top w:val="single" w:color="auto" w:sz="4"/>
+          <w:left w:val="single" w:color="auto" w:sz="4"/>
+          <w:bottom w:val="single" w:color="auto" w:sz="4"/>
+          <w:right w:val="single" w:color="auto" w:sz="4"/>
+          <w:insideH w:val="single" w:color="auto" w:sz="4"/>
+          <w:insideV w:val="single" w:color="auto" w:sz="4"/>
+        </w:tblBorders>
+      </w:tblPr>
+      <w:tblGrid>
+        <w:gridCol w:w="1500"/>
+        <w:gridCol w:w="8138"/>
+      </w:tblGrid>
+      <w:tr>
+        <w:trPr>
+          <w:cantSplit/>
+        </w:trPr>
+        <w:tc>
+          <w:tcPr>
+            <w:tcW w:type="dxa" w:w="1500"/>
+            <w:tcBorders>
+              <w:top w:val="single" w:color="D5DBE7" w:sz="4"/>
+              <w:left w:val="single" w:color="D5DBE7" w:sz="4"/>
+              <w:bottom w:val="single" w:color="D5DBE7" w:sz="4"/>
+              <w:right w:val="single" w:color="D5DBE7" w:sz="4"/>
+            </w:tcBorders>
+            <w:shd w:fill="E8EBFA" w:color="auto" w:val="clear"/>
+            <w:tcMar>
+              <w:top w:type="dxa" w:w="70"/>
+              <w:left w:type="dxa" w:w="110"/>
+              <w:bottom w:type="dxa" w:w="70"/>
+              <w:right w:type="dxa" w:w="110"/>
+            </w:tcMar>
+          </w:tcPr>
+          <w:p>
+            <w:r>
+              <w:rPr>
+                <w:rFonts w:ascii="Arial" w:cs="Arial" w:eastAsia="Arial" w:hAnsi="Arial"/>
+                <w:b/>
+                <w:bCs/>
+                <w:sz w:val="19"/>
+                <w:szCs w:val="19"/>
+              </w:rPr>
+              <w:t xml:space="preserve">Do</w:t>
+            </w:r>
+          </w:p>
+        </w:tc>
+        <w:tc>
+          <w:tcPr>
+            <w:tcW w:type="dxa" w:w="8138"/>
+            <w:tcBorders>
+              <w:top w:val="single" w:color="D5DBE7" w:sz="4"/>
+              <w:left w:val="single" w:color="D5DBE7" w:sz="4"/>
+              <w:bottom w:val="single" w:color="D5DBE7" w:sz="4"/>
+              <w:right w:val="single" w:color="D5DBE7" w:sz="4"/>
+            </w:tcBorders>
+            <w:tcMar>
+              <w:top w:type="dxa" w:w="70"/>
+              <w:left w:type="dxa" w:w="110"/>
+              <w:bottom w:type="dxa" w:w="70"/>
+              <w:right w:type="dxa" w:w="110"/>
+            </w:tcMar>
+          </w:tcPr>
+          <w:p>
+            <w:pPr>
+              <w:spacing w:after="40" w:line="264"/>
+            </w:pPr>
+            <w:r>
+              <w:rPr>
+                <w:rFonts w:ascii="Arial" w:cs="Arial" w:eastAsia="Arial" w:hAnsi="Arial"/>
+                <w:sz w:val="19"/>
+                <w:szCs w:val="19"/>
+              </w:rPr>
+              <w:t xml:space="preserve">Ask the judge to open any ordinary post (for example the wallet post) and add the comment from sample I in section 6.</w:t>
+            </w:r>
+          </w:p>
+        </w:tc>
+      </w:tr>
+      <w:tr>
+        <w:trPr>
+          <w:cantSplit/>
+        </w:trPr>
+        <w:tc>
+          <w:tcPr>
+            <w:tcW w:type="dxa" w:w="1500"/>
+            <w:tcBorders>
+              <w:top w:val="single" w:color="D5DBE7" w:sz="4"/>
+              <w:left w:val="single" w:color="D5DBE7" w:sz="4"/>
+              <w:bottom w:val="single" w:color="D5DBE7" w:sz="4"/>
+              <w:right w:val="single" w:color="D5DBE7" w:sz="4"/>
+            </w:tcBorders>
+            <w:shd w:fill="F1F8F4" w:color="auto" w:val="clear"/>
+            <w:tcMar>
+              <w:top w:type="dxa" w:w="70"/>
+              <w:left w:type="dxa" w:w="110"/>
+              <w:bottom w:type="dxa" w:w="70"/>
+              <w:right w:type="dxa" w:w="110"/>
+            </w:tcMar>
+          </w:tcPr>
+          <w:p>
+            <w:r>
+              <w:rPr>
+                <w:rFonts w:ascii="Arial" w:cs="Arial" w:eastAsia="Arial" w:hAnsi="Arial"/>
+                <w:b/>
+                <w:bCs/>
+                <w:sz w:val="19"/>
+                <w:szCs w:val="19"/>
+              </w:rPr>
+              <w:t xml:space="preserve">Say</w:t>
+            </w:r>
+          </w:p>
+        </w:tc>
+        <w:tc>
+          <w:tcPr>
+            <w:tcW w:type="dxa" w:w="8138"/>
+            <w:tcBorders>
+              <w:top w:val="single" w:color="D5DBE7" w:sz="4"/>
+              <w:left w:val="single" w:color="D5DBE7" w:sz="4"/>
+              <w:bottom w:val="single" w:color="D5DBE7" w:sz="4"/>
+              <w:right w:val="single" w:color="D5DBE7" w:sz="4"/>
+            </w:tcBorders>
+            <w:tcMar>
+              <w:top w:type="dxa" w:w="70"/>
+              <w:left w:type="dxa" w:w="110"/>
+              <w:bottom w:type="dxa" w:w="70"/>
+              <w:right w:type="dxa" w:w="110"/>
+            </w:tcMar>
+          </w:tcPr>
+          <w:p>
+            <w:pPr>
+              <w:spacing w:after="40" w:line="264"/>
+            </w:pPr>
+            <w:r>
+              <w:rPr>
+                <w:rFonts w:ascii="Arial" w:cs="Arial" w:eastAsia="Arial" w:hAnsi="Arial"/>
+                <w:sz w:val="19"/>
+                <w:szCs w:val="19"/>
+              </w:rPr>
+              <w:t xml:space="preserve">"Sellers know feeds are watched, so they hide in the comments of harmless posts. MuleWatch reads every comment too."</w:t>
+            </w:r>
+          </w:p>
+        </w:tc>
+      </w:tr>
+      <w:tr>
+        <w:trPr>
+          <w:cantSplit/>
+        </w:trPr>
+        <w:tc>
+          <w:tcPr>
+            <w:tcW w:type="dxa" w:w="1500"/>
+            <w:tcBorders>
+              <w:top w:val="single" w:color="D5DBE7" w:sz="4"/>
+              <w:left w:val="single" w:color="D5DBE7" w:sz="4"/>
+              <w:bottom w:val="single" w:color="D5DBE7" w:sz="4"/>
+              <w:right w:val="single" w:color="D5DBE7" w:sz="4"/>
+            </w:tcBorders>
+            <w:shd w:fill="FDF3E7" w:color="auto" w:val="clear"/>
+            <w:tcMar>
+              <w:top w:type="dxa" w:w="70"/>
+              <w:left w:type="dxa" w:w="110"/>
+              <w:bottom w:type="dxa" w:w="70"/>
+              <w:right w:type="dxa" w:w="110"/>
+            </w:tcMar>
+          </w:tcPr>
+          <w:p>
+            <w:r>
+              <w:rPr>
+                <w:rFonts w:ascii="Arial" w:cs="Arial" w:eastAsia="Arial" w:hAnsi="Arial"/>
+                <w:b/>
+                <w:bCs/>
+                <w:sz w:val="19"/>
+                <w:szCs w:val="19"/>
+              </w:rPr>
+              <w:t xml:space="preserve">Judges see</w:t>
+            </w:r>
+          </w:p>
+        </w:tc>
+        <w:tc>
+          <w:tcPr>
+            <w:tcW w:type="dxa" w:w="8138"/>
+            <w:tcBorders>
+              <w:top w:val="single" w:color="D5DBE7" w:sz="4"/>
+              <w:left w:val="single" w:color="D5DBE7" w:sz="4"/>
+              <w:bottom w:val="single" w:color="D5DBE7" w:sz="4"/>
+              <w:right w:val="single" w:color="D5DBE7" w:sz="4"/>
+            </w:tcBorders>
+            <w:tcMar>
+              <w:top w:type="dxa" w:w="70"/>
+              <w:left w:type="dxa" w:w="110"/>
+              <w:bottom w:type="dxa" w:w="70"/>
+              <w:right w:type="dxa" w:w="110"/>
+            </w:tcMar>
+          </w:tcPr>
+          <w:p>
+            <w:pPr>
+              <w:spacing w:after="40" w:line="264"/>
+            </w:pPr>
+            <w:r>
+              <w:rPr>
+                <w:rFonts w:ascii="Arial" w:cs="Arial" w:eastAsia="Arial" w:hAnsi="Arial"/>
+                <w:sz w:val="19"/>
+                <w:szCs w:val="19"/>
+              </w:rPr>
+              <w:t xml:space="preserve">A </w:t>
+            </w:r>
+            <w:r>
+              <w:rPr>
+                <w:rFonts w:ascii="Arial" w:cs="Arial" w:eastAsia="Arial" w:hAnsi="Arial"/>
+                <w:b/>
+                <w:bCs/>
+                <w:sz w:val="19"/>
+                <w:szCs w:val="19"/>
+              </w:rPr>
+              <w:t xml:space="preserve">High</w:t>
+            </w:r>
+            <w:r>
+              <w:rPr>
+                <w:rFonts w:ascii="Arial" w:cs="Arial" w:eastAsia="Arial" w:hAnsi="Arial"/>
+                <w:sz w:val="19"/>
+                <w:szCs w:val="19"/>
+              </w:rPr>
+              <w:t xml:space="preserve"> alert within a few seconds, tagged </w:t>
+            </w:r>
+            <w:r>
+              <w:rPr>
+                <w:rFonts w:ascii="Arial" w:cs="Arial" w:eastAsia="Arial" w:hAnsi="Arial"/>
+                <w:b/>
+                <w:bCs/>
+                <w:sz w:val="19"/>
+                <w:szCs w:val="19"/>
+              </w:rPr>
+              <w:t xml:space="preserve">comment</w:t>
+            </w:r>
+            <w:r>
+              <w:rPr>
+                <w:rFonts w:ascii="Arial" w:cs="Arial" w:eastAsia="Arial" w:hAnsi="Arial"/>
+                <w:sz w:val="19"/>
+                <w:szCs w:val="19"/>
+              </w:rPr>
+              <w:t xml:space="preserve">, with the reason Easy-money lure. Request takedown hides just that comment on the forum.</w:t>
+            </w:r>
+          </w:p>
+        </w:tc>
+      </w:tr>
+    </w:tbl>
+    <w:p>
+      <w:pPr>
+        <w:spacing w:after="160"/>
+      </w:pPr>
+    </w:p>
+    <w:p>
+      <w:pPr>
+        <w:pStyle w:val="Heading3"/>
+        <w:keepNext/>
+      </w:pPr>
+      <w:r>
+        <w:rPr>
+          <w:rFonts w:ascii="Arial" w:cs="Arial" w:eastAsia="Arial" w:hAnsi="Arial"/>
+        </w:rPr>
         <w:t xml:space="preserve">Step 4. Open the case and explain the evidence (60 s)</w:t>
       </w:r>
     </w:p>
@@ -9868,6 +10133,162 @@
                 <w:sz w:val="19"/>
                 <w:szCs w:val="19"/>
               </w:rPr>
+              <w:t xml:space="preserve">I</w:t>
+            </w:r>
+          </w:p>
+        </w:tc>
+        <w:tc>
+          <w:tcPr>
+            <w:tcW w:type="dxa" w:w="1500"/>
+            <w:tcBorders>
+              <w:top w:val="single" w:color="D5DBE7" w:sz="4"/>
+              <w:left w:val="single" w:color="D5DBE7" w:sz="4"/>
+              <w:bottom w:val="single" w:color="D5DBE7" w:sz="4"/>
+              <w:right w:val="single" w:color="D5DBE7" w:sz="4"/>
+            </w:tcBorders>
+            <w:tcMar>
+              <w:top w:type="dxa" w:w="70"/>
+              <w:left w:type="dxa" w:w="110"/>
+              <w:bottom w:type="dxa" w:w="70"/>
+              <w:right w:type="dxa" w:w="110"/>
+            </w:tcMar>
+          </w:tcPr>
+          <w:p>
+            <w:pPr>
+              <w:spacing w:after="30" w:line="260"/>
+            </w:pPr>
+            <w:r>
+              <w:rPr>
+                <w:rFonts w:ascii="Arial" w:cs="Arial" w:eastAsia="Arial" w:hAnsi="Arial"/>
+                <w:sz w:val="19"/>
+                <w:szCs w:val="19"/>
+              </w:rPr>
+              <w:t xml:space="preserve">A comment under any post</w:t>
+            </w:r>
+          </w:p>
+        </w:tc>
+        <w:tc>
+          <w:tcPr>
+            <w:tcW w:type="dxa" w:w="2100"/>
+            <w:tcBorders>
+              <w:top w:val="single" w:color="D5DBE7" w:sz="4"/>
+              <w:left w:val="single" w:color="D5DBE7" w:sz="4"/>
+              <w:bottom w:val="single" w:color="D5DBE7" w:sz="4"/>
+              <w:right w:val="single" w:color="D5DBE7" w:sz="4"/>
+            </w:tcBorders>
+            <w:tcMar>
+              <w:top w:type="dxa" w:w="70"/>
+              <w:left w:type="dxa" w:w="110"/>
+              <w:bottom w:type="dxa" w:w="70"/>
+              <w:right w:type="dxa" w:w="110"/>
+            </w:tcMar>
+          </w:tcPr>
+          <w:p>
+            <w:pPr>
+              <w:spacing w:after="30" w:line="260"/>
+            </w:pPr>
+            <w:r>
+              <w:rPr>
+                <w:rFonts w:ascii="Arial" w:cs="Arial" w:eastAsia="Arial" w:hAnsi="Arial"/>
+                <w:sz w:val="19"/>
+                <w:szCs w:val="19"/>
+              </w:rPr>
+              <w:t xml:space="preserve">(comment)</w:t>
+            </w:r>
+          </w:p>
+        </w:tc>
+        <w:tc>
+          <w:tcPr>
+            <w:tcW w:type="dxa" w:w="3538"/>
+            <w:tcBorders>
+              <w:top w:val="single" w:color="D5DBE7" w:sz="4"/>
+              <w:left w:val="single" w:color="D5DBE7" w:sz="4"/>
+              <w:bottom w:val="single" w:color="D5DBE7" w:sz="4"/>
+              <w:right w:val="single" w:color="D5DBE7" w:sz="4"/>
+            </w:tcBorders>
+            <w:tcMar>
+              <w:top w:type="dxa" w:w="70"/>
+              <w:left w:type="dxa" w:w="110"/>
+              <w:bottom w:type="dxa" w:w="70"/>
+              <w:right w:type="dxa" w:w="110"/>
+            </w:tcMar>
+          </w:tcPr>
+          <w:p>
+            <w:pPr>
+              <w:spacing w:after="30" w:line="260"/>
+            </w:pPr>
+            <w:r>
+              <w:rPr>
+                <w:rFonts w:ascii="Arial" w:cs="Arial" w:eastAsia="Arial" w:hAnsi="Arial"/>
+                <w:sz w:val="19"/>
+                <w:szCs w:val="19"/>
+              </w:rPr>
+              <w:t xml:space="preserve">Contact 7678246551 to earn money</w:t>
+            </w:r>
+          </w:p>
+        </w:tc>
+        <w:tc>
+          <w:tcPr>
+            <w:tcW w:type="dxa" w:w="2000"/>
+            <w:tcBorders>
+              <w:top w:val="single" w:color="D5DBE7" w:sz="4"/>
+              <w:left w:val="single" w:color="D5DBE7" w:sz="4"/>
+              <w:bottom w:val="single" w:color="D5DBE7" w:sz="4"/>
+              <w:right w:val="single" w:color="D5DBE7" w:sz="4"/>
+            </w:tcBorders>
+            <w:tcMar>
+              <w:top w:type="dxa" w:w="70"/>
+              <w:left w:type="dxa" w:w="110"/>
+              <w:bottom w:type="dxa" w:w="70"/>
+              <w:right w:type="dxa" w:w="110"/>
+            </w:tcMar>
+          </w:tcPr>
+          <w:p>
+            <w:pPr>
+              <w:spacing w:after="30" w:line="260"/>
+            </w:pPr>
+            <w:r>
+              <w:rPr>
+                <w:rFonts w:ascii="Arial" w:cs="Arial" w:eastAsia="Arial" w:hAnsi="Arial"/>
+                <w:sz w:val="19"/>
+                <w:szCs w:val="19"/>
+              </w:rPr>
+              <w:t xml:space="preserve">High, tagged comment; Request takedown hides only the comment</w:t>
+            </w:r>
+          </w:p>
+        </w:tc>
+      </w:tr>
+      <w:tr>
+        <w:trPr>
+          <w:cantSplit/>
+          <w:tblHeader w:val="false"/>
+        </w:trPr>
+        <w:tc>
+          <w:tcPr>
+            <w:tcW w:type="dxa" w:w="500"/>
+            <w:tcBorders>
+              <w:top w:val="single" w:color="D5DBE7" w:sz="4"/>
+              <w:left w:val="single" w:color="D5DBE7" w:sz="4"/>
+              <w:bottom w:val="single" w:color="D5DBE7" w:sz="4"/>
+              <w:right w:val="single" w:color="D5DBE7" w:sz="4"/>
+            </w:tcBorders>
+            <w:tcMar>
+              <w:top w:type="dxa" w:w="70"/>
+              <w:left w:type="dxa" w:w="110"/>
+              <w:bottom w:type="dxa" w:w="70"/>
+              <w:right w:type="dxa" w:w="110"/>
+            </w:tcMar>
+          </w:tcPr>
+          <w:p>
+            <w:pPr>
+              <w:spacing w:after="30" w:line="260"/>
+            </w:pPr>
+            <w:r>
+              <w:rPr>
+                <w:rFonts w:ascii="Arial" w:cs="Arial" w:eastAsia="Arial" w:hAnsi="Arial"/>
+                <w:sz w:val="19"/>
+                <w:szCs w:val="19"/>
+              </w:rPr>
               <w:t xml:space="preserve">H</w:t>
             </w:r>
           </w:p>
@@ -12058,7 +12479,7 @@
         <w:rPr>
           <w:rFonts w:ascii="Arial" w:cs="Arial" w:eastAsia="Arial" w:hAnsi="Arial"/>
         </w:rPr>
-        <w:t xml:space="preserve">On the 50 forum posts, which the model never saw during training (16 mule or card ads, 34 normal or tricky), it caught all 16 with no false alarms. Run </w:t>
+        <w:t xml:space="preserve">On the 50 forum posts and 17 comments, which the model never saw during training (19 mule, card or easy-money items, 48 normal or tricky), it caught all 19 with no false alarms. Run </w:t>
       </w:r>
       <w:r>
         <w:rPr>

</xml_diff>

<commit_message>
Link phone alerts by sending /alerts <code> to the bot; no chat ID lookup needed
Co-Authored-By: Claude Opus 5.5 <noreply@anthropic.com>
Claude-Session: https://claude.ai/code/session_017kSrnrRRwV6yimEEKpq2Uf
</commit_message>
<xml_diff>
--- a/docs/MuleWatch_Demo_Guide.docx
+++ b/docs/MuleWatch_Demo_Guide.docx
@@ -4742,7 +4742,35 @@
         <w:rPr>
           <w:rFonts w:ascii="Arial" w:cs="Arial" w:eastAsia="Arial" w:hAnsi="Arial"/>
         </w:rPr>
-        <w:t xml:space="preserve">For phone alerts too: send your bot any message, open </w:t>
+        <w:t xml:space="preserve">For Critical alerts on your phone: in </w:t>
+      </w:r>
+      <w:r>
+        <w:rPr>
+          <w:rFonts w:ascii="Arial" w:cs="Arial" w:eastAsia="Arial" w:hAnsi="Arial"/>
+          <w:b/>
+          <w:bCs/>
+        </w:rPr>
+        <w:t xml:space="preserve">Monitored sources</w:t>
+      </w:r>
+      <w:r>
+        <w:rPr>
+          <w:rFonts w:ascii="Arial" w:cs="Arial" w:eastAsia="Arial" w:hAnsi="Arial"/>
+        </w:rPr>
+        <w:t xml:space="preserve">, the bot panel shows </w:t>
+      </w:r>
+      <w:r>
+        <w:rPr>
+          <w:rFonts w:ascii="Arial" w:cs="Arial" w:eastAsia="Arial" w:hAnsi="Arial"/>
+          <w:b/>
+          <w:bCs/>
+        </w:rPr>
+        <w:t xml:space="preserve">Phone alerts: send /alerts 123456</w:t>
+      </w:r>
+      <w:r>
+        <w:rPr>
+          <w:rFonts w:ascii="Arial" w:cs="Arial" w:eastAsia="Arial" w:hAnsi="Arial"/>
+        </w:rPr>
+        <w:t xml:space="preserve">. Send exactly that message to your bot from your phone. The bot replies Linked and alerts start arriving. Send </w:t>
       </w:r>
       <w:r>
         <w:rPr>
@@ -4752,61 +4780,13 @@
           <w:szCs w:val="20"/>
           <w:shd w:fill="EEF0F7" w:color="auto" w:val="clear"/>
         </w:rPr>
-        <w:t xml:space="preserve">https://api.telegram.org/bot&lt;TOKEN&gt;/getUpdates</w:t>
-      </w:r>
-      <w:r>
-        <w:rPr>
-          <w:rFonts w:ascii="Arial" w:cs="Arial" w:eastAsia="Arial" w:hAnsi="Arial"/>
-        </w:rPr>
-        <w:t xml:space="preserve"> in a browser, copy the number after </w:t>
-      </w:r>
-      <w:r>
-        <w:rPr>
-          <w:rFonts w:ascii="Consolas" w:cs="Consolas" w:eastAsia="Consolas" w:hAnsi="Consolas"/>
-          <w:color w:val="1F2A7A"/>
-          <w:sz w:val="20"/>
-          <w:szCs w:val="20"/>
-          <w:shd w:fill="EEF0F7" w:color="auto" w:val="clear"/>
-        </w:rPr>
-        <w:t xml:space="preserve">"chat":{"id":</w:t>
-      </w:r>
-      <w:r>
-        <w:rPr>
-          <w:rFonts w:ascii="Arial" w:cs="Arial" w:eastAsia="Arial" w:hAnsi="Arial"/>
-        </w:rPr>
-        <w:t xml:space="preserve"> into </w:t>
-      </w:r>
-      <w:r>
-        <w:rPr>
-          <w:rFonts w:ascii="Consolas" w:cs="Consolas" w:eastAsia="Consolas" w:hAnsi="Consolas"/>
-          <w:color w:val="1F2A7A"/>
-          <w:sz w:val="20"/>
-          <w:szCs w:val="20"/>
-          <w:shd w:fill="EEF0F7" w:color="auto" w:val="clear"/>
-        </w:rPr>
-        <w:t xml:space="preserve">.env</w:t>
-      </w:r>
-      <w:r>
-        <w:rPr>
-          <w:rFonts w:ascii="Arial" w:cs="Arial" w:eastAsia="Arial" w:hAnsi="Arial"/>
-        </w:rPr>
-        <w:t xml:space="preserve"> as </w:t>
-      </w:r>
-      <w:r>
-        <w:rPr>
-          <w:rFonts w:ascii="Consolas" w:cs="Consolas" w:eastAsia="Consolas" w:hAnsi="Consolas"/>
-          <w:color w:val="1F2A7A"/>
-          <w:sz w:val="20"/>
-          <w:szCs w:val="20"/>
-          <w:shd w:fill="EEF0F7" w:color="auto" w:val="clear"/>
-        </w:rPr>
-        <w:t xml:space="preserve">TELEGRAM_CHAT_ID</w:t>
-      </w:r>
-      <w:r>
-        <w:rPr>
-          <w:rFonts w:ascii="Arial" w:cs="Arial" w:eastAsia="Arial" w:hAnsi="Arial"/>
-        </w:rPr>
-        <w:t xml:space="preserve">, and restart.</w:t>
+        <w:t xml:space="preserve">/alerts off</w:t>
+      </w:r>
+      <w:r>
+        <w:rPr>
+          <w:rFonts w:ascii="Arial" w:cs="Arial" w:eastAsia="Arial" w:hAnsi="Arial"/>
+        </w:rPr>
+        <w:t xml:space="preserve"> to stop. (No chat ID needed.)</w:t>
       </w:r>
     </w:p>
     <w:p>

</xml_diff>